<commit_message>
Fix remaining FY17 wording in history read v2
Co-Authored-By: Claude Fable 5.1 <noreply@anthropic.com>
Claude-Session: https://claude.ai/code/session_015epyZKZUkmLvmzDXXcj4JD
</commit_message>
<xml_diff>
--- a/research/ASIANENE/notes/ASIANENE_History_Read_v2.docx
+++ b/research/ASIANENE/notes/ASIANENE_History_Read_v2.docx
@@ -961,7 +961,7 @@
                 <w:sz w:val="17"/>
                 <w:szCs w:val="17"/>
               </w:rPr>
-              <w:t xml:space="preserve">-15% (FY17, incl. Rs.43cr ESOP) then 18%, 17%, 24%</w:t>
+              <w:t xml:space="preserve">-15% (FY17, after Rs.36cr of bad-debt write-offs and provisions) then 18%, 17%, 24%</w:t>
             </w:r>
           </w:p>
         </w:tc>
@@ -2045,7 +2045,7 @@
                 <w:sz w:val="17"/>
                 <w:szCs w:val="17"/>
               </w:rPr>
-              <w:t xml:space="preserve">Oilmax Energy acquired control via preferential issue. Rs.43cr ESOP charge; Rs.19cr liabilities written back into other income.</w:t>
+              <w:t xml:space="preserve">Oilmax Energy acquired control via preferential issue. Rs.36cr of bad-debt write-offs and provisions; Rs.19.2cr write-back of payables and ICDs booked as an exceptional gain.</w:t>
             </w:r>
           </w:p>
         </w:tc>

</xml_diff>